<commit_message>
review(G1-11): rework consistency fixes and verification
</commit_message>
<xml_diff>
--- a/docs/deliverables/00-投标文件技术标.docx
+++ b/docs/deliverables/00-投标文件技术标.docx
@@ -217,7 +217,8 @@
         <w:keepLines/>
       </w:pPr>
       <w:r>
-        <w:t>我方已按冻结基线理解本项目的范围、39条功能需求、34条带★功能条款、5项非功能或部署类★条款、20项法规标准和全部实施、服务、验收要求。本方案对上述要求均作响应，未提出正偏离或负偏离。历史录像回放、人员定位、疏散门禁、统一消息、中台、地图、H5、部署环境、基础数据、外部接口和应用安全均按12项课程模拟甲方书面澄清执行。</w:t>
+        <w:rPr/>
+        <w:t>我方已按冻结基线理解本项目的范围、39条功能需求、34条带★功能条款、5项非功能或部署类★条款、20项法规标准和全部实施、服务、验收要求。本方案对上述要求均作响应，未提出正偏离或负偏离。历史录像回放、人员定位、疏散门禁、统一消息、中台、地图、H5、部署环境、基础数据、外部接口和应用安全均参考12项课程模拟甲方/招标人书面澄清组织方案；原始需求书的明确强制要求始终优先。</w:t>
       </w:r>
     </w:p>
     <w:p>
@@ -2784,7 +2785,8 @@
         <w:keepLines/>
       </w:pPr>
       <w:r>
-        <w:t>十二项澄清是本课程模拟中已经确定的甲方解释，用于解决真实需求书中的歧义并冻结当前编标口径。它们不代表现实单位签章或法律文件，也不证明接口和指标已现场验收。</w:t>
+        <w:rPr/>
+        <w:t>十二项澄清是本课程模拟中已经确定的甲方/招标人解释，用于解决真实需求书中的歧义并冻结当前编标口径。它们不代表现实单位签章或法律文件，也不证明接口和指标已现场验收。澄清不得覆盖原始需求书的明确强制要求；凡涉及既有系统存储、基础环境、地图生产、宿主发布或第三方测评等范围及责任分配，均为课程模拟实施边界，须在现实采购或实施前取得教师/模拟甲方的确认后方可作为实际责任划分依据。</w:t>
       </w:r>
     </w:p>
     <w:tbl>
@@ -2885,11 +2887,11 @@
             </w:pPr>
             <w:r>
               <w:rPr>
-                <w:rFonts w:ascii="宋体" w:hAnsi="宋体" w:eastAsia="宋体"/>
-                <w:b w:val="0"/>
-                <w:sz w:val="18"/>
-              </w:rPr>
-              <w:t>历史回放强制；既有视频系统负责录像与不少于30天保存，本项目负责调阅、回放和验证</w:t>
+                <w:rFonts w:ascii="宋体" w:hAnsi="宋体"/>
+                <w:b w:val="0"/>
+                <w:sz w:val="18"/>
+              </w:rPr>
+              <w:t>课程模拟澄清：既有视频系统负责录像与不少于30天保存；本项目负责调阅、回放和验证。该责任分配不覆盖原始需求书明确强制要求，现实采购或实施前待教师/模拟甲方确认。</w:t>
             </w:r>
           </w:p>
         </w:tc>
@@ -10046,11 +10048,11 @@
             </w:pPr>
             <w:r>
               <w:rPr>
-                <w:rFonts w:ascii="宋体" w:hAnsi="宋体" w:eastAsia="宋体"/>
-                <w:b w:val="0"/>
-                <w:sz w:val="18"/>
-              </w:rPr>
-              <w:t>实时视频一键调阅、GB/T 28181；结合 P1 §3.3、§8.1及模拟裁决，历史录像回放按强制要求处理，既有视频系统负责存储及≥30天保存，乙方负责接口调阅、回放和验证</w:t>
+                <w:rFonts w:ascii="宋体" w:hAnsi="宋体"/>
+                <w:b w:val="0"/>
+                <w:sz w:val="18"/>
+              </w:rPr>
+              <w:t>本条整体为★：实时视频一键调阅、GB/T 28181；其中“历史回放”子句为“宜支持”。但原始需求书 §8.1(1) 接口要求及 FR-11.3 对录像检索/历史回放提出强制接口响应，故本方案实施调阅、回放和验证；既有视频系统存储及≥30天保存的课程模拟责任边界待教师/模拟甲方确认</w:t>
             </w:r>
           </w:p>
         </w:tc>
@@ -11268,7 +11270,7 @@
         <w:keepLines/>
       </w:pPr>
       <w:r>
-        <w:t>制定计划并选择预案版本，系统按周期生成任务并通知执行人。执行人按流程反馈，结束后依据条目化模板评分和记录问题，责任人制定改进措施并跟踪关闭。</w:t>
+        <w:t>制定计划并选择预案版本，系统按周期生成任务并通知执行人。对适用每半年至少一次的对象，系统以滚动六个月窗口统计具备执行证据的已关闭实例；临近届满提示责任人，届满未达标标记逾期并进入整改或补演跟踪。频次统计、提醒、豁免说明和报告均可回溯至计划与实例。</w:t>
       </w:r>
     </w:p>
     <w:p>
@@ -16218,7 +16220,8 @@
         <w:keepLines/>
       </w:pPr>
       <w:r>
-        <w:t>指标保障： 在甲方提供的正常可用验收通道内支持不少于 20 路并行，终端到达率不低于 99%（KN-006、KN-007）。</w:t>
+        <w:rPr/>
+        <w:t>指标保障： PE-04 消息推送不少于 20 路并行、终端到达率不低于 99%（内部台账 KN-006、KN-007）；在甲方提供的正常可用验收通道内验证。</w:t>
       </w:r>
     </w:p>
     <w:p>
@@ -16410,7 +16413,8 @@
         <w:keepLines/>
       </w:pPr>
       <w:r>
-        <w:t>指标保障： 地图常规操作不超过 2 秒（KN-035），人员位置刷新不超过 2 秒/次且不降低甲方亚米级源精度（KN-008、KN-009），综合安防视图刷新不超过 30 秒（KN-016），应急信息视图默认不超过 60 秒（KN-017）。</w:t>
+        <w:rPr/>
+        <w:t>指标保障： PE-08 地图常规操作不超过 2 秒（内部台账 KN-035）；PE-05 人员位置刷新不超过 2 秒/次且不降低甲方亚米级源精度（内部台账 KN-008、KN-009）；PE-10 综合安防视图刷新不超过 30 秒、应急信息视图默认不超过 60 秒（内部台账 KN-016、KN-017）。</w:t>
       </w:r>
     </w:p>
     <w:p>
@@ -16550,7 +16554,8 @@
         <w:keepLines/>
       </w:pPr>
       <w:r>
-        <w:t>指标保障： 报警/告警输入响应不超过 2 秒（KN-011）；视频首帧不超过 3 秒（KN-010）；竣工验收完成视频、信息发布、物联网和中台四系统端到端联动（KN-064）。</w:t>
+        <w:rPr/>
+        <w:t>指标保障： PE-02 报警/告警输入响应不超过 2 秒（内部台账 KN-011）；PE-06 视频首帧不超过 3 秒（内部台账 KN-010）；竣工验收完成视频、信息发布、物联网和中台四系统端到端联动（内部台账 KN-064）。</w:t>
       </w:r>
     </w:p>
     <w:p>
@@ -16754,7 +16759,8 @@
         <w:keepLines/>
       </w:pPr>
       <w:r>
-        <w:t>指标保障： 扫码打卡写入/回传不超过 1 秒（KN-036）；位置刷新不超过 2 秒/次且不降低源精度（KN-008、KN-009）。</w:t>
+        <w:rPr/>
+        <w:t>指标保障： PE-09 扫码打卡写入/回传不超过 1 秒（内部台账 KN-036）；PE-05 位置刷新不超过 2 秒/次且不降低源精度（内部台账 KN-008、KN-009）。</w:t>
       </w:r>
     </w:p>
     <w:p>
@@ -16949,6 +16955,569 @@
         <w:t>5.12 性能与容量</w:t>
       </w:r>
     </w:p>
+    <w:p>
+      <w:r>
+        <w:t>性能条款在正式响应中以原始需求书的 PE 编号为主，KN 仅用于内部控制台账。PE-01—PE-12 的逐项阈值、测试方法和证据索引如下；正文引用单项指标时同步标注对应 PE 编号。</w:t>
+      </w:r>
+    </w:p>
+    <w:tbl>
+      <w:tblPr>
+        <w:tblW w:type="auto" w:w="0"/>
+        <w:tblLook w:firstColumn="1" w:firstRow="1" w:lastColumn="0" w:lastRow="0" w:noHBand="0" w:noVBand="1" w:val="04A0"/>
+      </w:tblPr>
+      <w:tblGrid>
+        <w:gridCol w:w="2257"/>
+        <w:gridCol w:w="2257"/>
+        <w:gridCol w:w="2257"/>
+        <w:gridCol w:w="2257"/>
+      </w:tblGrid>
+      <w:tr>
+        <w:tc>
+          <w:tcPr>
+            <w:tcW w:type="dxa" w:w="2257"/>
+          </w:tcPr>
+          <w:p>
+            <w:r>
+              <w:t>PE 编号</w:t>
+            </w:r>
+          </w:p>
+        </w:tc>
+        <w:tc>
+          <w:tcPr>
+            <w:tcW w:type="dxa" w:w="2257"/>
+          </w:tcPr>
+          <w:p>
+            <w:r>
+              <w:t>对外响应指标</w:t>
+            </w:r>
+          </w:p>
+        </w:tc>
+        <w:tc>
+          <w:tcPr>
+            <w:tcW w:type="dxa" w:w="2257"/>
+          </w:tcPr>
+          <w:p>
+            <w:r>
+              <w:t>验证要点</w:t>
+            </w:r>
+          </w:p>
+        </w:tc>
+        <w:tc>
+          <w:tcPr>
+            <w:tcW w:type="dxa" w:w="2257"/>
+          </w:tcPr>
+          <w:p>
+            <w:r>
+              <w:t>内部台账</w:t>
+            </w:r>
+          </w:p>
+        </w:tc>
+      </w:tr>
+      <w:tr>
+        <w:tc>
+          <w:tcPr>
+            <w:tcW w:type="dxa" w:w="2257"/>
+          </w:tcPr>
+          <w:p>
+            <w:r>
+              <w:t>PE-01</w:t>
+            </w:r>
+          </w:p>
+        </w:tc>
+        <w:tc>
+          <w:tcPr>
+            <w:tcW w:type="dxa" w:w="2257"/>
+          </w:tcPr>
+          <w:p>
+            <w:r>
+              <w:t>预案启动通知/任务下发 ≤3秒</w:t>
+            </w:r>
+          </w:p>
+        </w:tc>
+        <w:tc>
+          <w:tcPr>
+            <w:tcW w:type="dxa" w:w="2257"/>
+          </w:tcPr>
+          <w:p>
+            <w:r>
+              <w:t>服务端启动、任务与消息时间戳</w:t>
+            </w:r>
+          </w:p>
+        </w:tc>
+        <w:tc>
+          <w:tcPr>
+            <w:tcW w:type="dxa" w:w="2257"/>
+          </w:tcPr>
+          <w:p>
+            <w:r>
+              <w:t>KN-003</w:t>
+            </w:r>
+          </w:p>
+        </w:tc>
+      </w:tr>
+      <w:tr>
+        <w:tc>
+          <w:tcPr>
+            <w:tcW w:type="dxa" w:w="2257"/>
+          </w:tcPr>
+          <w:p>
+            <w:r>
+              <w:t>PE-02</w:t>
+            </w:r>
+          </w:p>
+        </w:tc>
+        <w:tc>
+          <w:tcPr>
+            <w:tcW w:type="dxa" w:w="2257"/>
+          </w:tcPr>
+          <w:p>
+            <w:r>
+              <w:t>报警/告警输入响应 ≤2秒</w:t>
+            </w:r>
+          </w:p>
+        </w:tc>
+        <w:tc>
+          <w:tcPr>
+            <w:tcW w:type="dxa" w:w="2257"/>
+          </w:tcPr>
+          <w:p>
+            <w:r>
+              <w:t>告警源与事件时间戳</w:t>
+            </w:r>
+          </w:p>
+        </w:tc>
+        <w:tc>
+          <w:tcPr>
+            <w:tcW w:type="dxa" w:w="2257"/>
+          </w:tcPr>
+          <w:p>
+            <w:r>
+              <w:t>KN-011</w:t>
+            </w:r>
+          </w:p>
+        </w:tc>
+      </w:tr>
+      <w:tr>
+        <w:tc>
+          <w:tcPr>
+            <w:tcW w:type="dxa" w:w="2257"/>
+          </w:tcPr>
+          <w:p>
+            <w:r>
+              <w:t>PE-03</w:t>
+            </w:r>
+          </w:p>
+        </w:tc>
+        <w:tc>
+          <w:tcPr>
+            <w:tcW w:type="dxa" w:w="2257"/>
+          </w:tcPr>
+          <w:p>
+            <w:r>
+              <w:t>事件确认至处置任务下达 ≤3分钟</w:t>
+            </w:r>
+          </w:p>
+        </w:tc>
+        <w:tc>
+          <w:tcPr>
+            <w:tcW w:type="dxa" w:w="2257"/>
+          </w:tcPr>
+          <w:p>
+            <w:r>
+              <w:t>审批与任务时间线</w:t>
+            </w:r>
+          </w:p>
+        </w:tc>
+        <w:tc>
+          <w:tcPr>
+            <w:tcW w:type="dxa" w:w="2257"/>
+          </w:tcPr>
+          <w:p>
+            <w:r>
+              <w:t>KN-012</w:t>
+            </w:r>
+          </w:p>
+        </w:tc>
+      </w:tr>
+      <w:tr>
+        <w:tc>
+          <w:tcPr>
+            <w:tcW w:type="dxa" w:w="2257"/>
+          </w:tcPr>
+          <w:p>
+            <w:r>
+              <w:t>PE-04</w:t>
+            </w:r>
+          </w:p>
+        </w:tc>
+        <w:tc>
+          <w:tcPr>
+            <w:tcW w:type="dxa" w:w="2257"/>
+          </w:tcPr>
+          <w:p>
+            <w:r>
+              <w:t>消息 ≥20路并行、到达率 ≥99%</w:t>
+            </w:r>
+          </w:p>
+        </w:tc>
+        <w:tc>
+          <w:tcPr>
+            <w:tcW w:type="dxa" w:w="2257"/>
+          </w:tcPr>
+          <w:p>
+            <w:r>
+              <w:t>正常验收通道发送与回执</w:t>
+            </w:r>
+          </w:p>
+        </w:tc>
+        <w:tc>
+          <w:tcPr>
+            <w:tcW w:type="dxa" w:w="2257"/>
+          </w:tcPr>
+          <w:p>
+            <w:r>
+              <w:t>KN-006、KN-007</w:t>
+            </w:r>
+          </w:p>
+        </w:tc>
+      </w:tr>
+      <w:tr>
+        <w:tc>
+          <w:tcPr>
+            <w:tcW w:type="dxa" w:w="2257"/>
+          </w:tcPr>
+          <w:p>
+            <w:r>
+              <w:t>PE-05</w:t>
+            </w:r>
+          </w:p>
+        </w:tc>
+        <w:tc>
+          <w:tcPr>
+            <w:tcW w:type="dxa" w:w="2257"/>
+          </w:tcPr>
+          <w:p>
+            <w:r>
+              <w:t>人员位置刷新 ≤2秒/次、源精度亚米级且不降低</w:t>
+            </w:r>
+          </w:p>
+        </w:tc>
+        <w:tc>
+          <w:tcPr>
+            <w:tcW w:type="dxa" w:w="2257"/>
+          </w:tcPr>
+          <w:p>
+            <w:r>
+              <w:t>源与展示坐标、时间戳</w:t>
+            </w:r>
+          </w:p>
+        </w:tc>
+        <w:tc>
+          <w:tcPr>
+            <w:tcW w:type="dxa" w:w="2257"/>
+          </w:tcPr>
+          <w:p>
+            <w:r>
+              <w:t>KN-008、KN-009</w:t>
+            </w:r>
+          </w:p>
+        </w:tc>
+      </w:tr>
+      <w:tr>
+        <w:tc>
+          <w:tcPr>
+            <w:tcW w:type="dxa" w:w="2257"/>
+          </w:tcPr>
+          <w:p>
+            <w:r>
+              <w:t>PE-06</w:t>
+            </w:r>
+          </w:p>
+        </w:tc>
+        <w:tc>
+          <w:tcPr>
+            <w:tcW w:type="dxa" w:w="2257"/>
+          </w:tcPr>
+          <w:p>
+            <w:r>
+              <w:t>视频调阅首帧 ≤3秒</w:t>
+            </w:r>
+          </w:p>
+        </w:tc>
+        <w:tc>
+          <w:tcPr>
+            <w:tcW w:type="dxa" w:w="2257"/>
+          </w:tcPr>
+          <w:p>
+            <w:r>
+              <w:t>请求、取流与首帧时间</w:t>
+            </w:r>
+          </w:p>
+        </w:tc>
+        <w:tc>
+          <w:tcPr>
+            <w:tcW w:type="dxa" w:w="2257"/>
+          </w:tcPr>
+          <w:p>
+            <w:r>
+              <w:t>KN-010</w:t>
+            </w:r>
+          </w:p>
+        </w:tc>
+      </w:tr>
+      <w:tr>
+        <w:tc>
+          <w:tcPr>
+            <w:tcW w:type="dxa" w:w="2257"/>
+          </w:tcPr>
+          <w:p>
+            <w:r>
+              <w:t>PE-07</w:t>
+            </w:r>
+          </w:p>
+        </w:tc>
+        <w:tc>
+          <w:tcPr>
+            <w:tcW w:type="dxa" w:w="2257"/>
+          </w:tcPr>
+          <w:p>
+            <w:r>
+              <w:t>Web 普通业务页面 95%请求 ≤3秒</w:t>
+            </w:r>
+          </w:p>
+        </w:tc>
+        <w:tc>
+          <w:tcPr>
+            <w:tcW w:type="dxa" w:w="2257"/>
+          </w:tcPr>
+          <w:p>
+            <w:r>
+              <w:t>分位数、采样与资源水位</w:t>
+            </w:r>
+          </w:p>
+        </w:tc>
+        <w:tc>
+          <w:tcPr>
+            <w:tcW w:type="dxa" w:w="2257"/>
+          </w:tcPr>
+          <w:p>
+            <w:r>
+              <w:t>KN-034</w:t>
+            </w:r>
+          </w:p>
+        </w:tc>
+      </w:tr>
+      <w:tr>
+        <w:tc>
+          <w:tcPr>
+            <w:tcW w:type="dxa" w:w="2257"/>
+          </w:tcPr>
+          <w:p>
+            <w:r>
+              <w:t>PE-08</w:t>
+            </w:r>
+          </w:p>
+        </w:tc>
+        <w:tc>
+          <w:tcPr>
+            <w:tcW w:type="dxa" w:w="2257"/>
+          </w:tcPr>
+          <w:p>
+            <w:r>
+              <w:t>地图常规操作 ≤2秒</w:t>
+            </w:r>
+          </w:p>
+        </w:tc>
+        <w:tc>
+          <w:tcPr>
+            <w:tcW w:type="dxa" w:w="2257"/>
+          </w:tcPr>
+          <w:p>
+            <w:r>
+              <w:t>视口操作、时间戳与资源水位</w:t>
+            </w:r>
+          </w:p>
+        </w:tc>
+        <w:tc>
+          <w:tcPr>
+            <w:tcW w:type="dxa" w:w="2257"/>
+          </w:tcPr>
+          <w:p>
+            <w:r>
+              <w:t>KN-035</w:t>
+            </w:r>
+          </w:p>
+        </w:tc>
+      </w:tr>
+      <w:tr>
+        <w:tc>
+          <w:tcPr>
+            <w:tcW w:type="dxa" w:w="2257"/>
+          </w:tcPr>
+          <w:p>
+            <w:r>
+              <w:t>PE-09</w:t>
+            </w:r>
+          </w:p>
+        </w:tc>
+        <w:tc>
+          <w:tcPr>
+            <w:tcW w:type="dxa" w:w="2257"/>
+          </w:tcPr>
+          <w:p>
+            <w:r>
+              <w:t>移动端扫码打卡写入/回传 ≤1秒</w:t>
+            </w:r>
+          </w:p>
+        </w:tc>
+        <w:tc>
+          <w:tcPr>
+            <w:tcW w:type="dxa" w:w="2257"/>
+          </w:tcPr>
+          <w:p>
+            <w:r>
+              <w:t>客户端、服务端与回执时间戳</w:t>
+            </w:r>
+          </w:p>
+        </w:tc>
+        <w:tc>
+          <w:tcPr>
+            <w:tcW w:type="dxa" w:w="2257"/>
+          </w:tcPr>
+          <w:p>
+            <w:r>
+              <w:t>KN-036</w:t>
+            </w:r>
+          </w:p>
+        </w:tc>
+      </w:tr>
+      <w:tr>
+        <w:tc>
+          <w:tcPr>
+            <w:tcW w:type="dxa" w:w="2257"/>
+          </w:tcPr>
+          <w:p>
+            <w:r>
+              <w:t>PE-10</w:t>
+            </w:r>
+          </w:p>
+        </w:tc>
+        <w:tc>
+          <w:tcPr>
+            <w:tcW w:type="dxa" w:w="2257"/>
+          </w:tcPr>
+          <w:p>
+            <w:r>
+              <w:t>综合安防视图 ≤30秒、应急信息视图默认 ≤60秒</w:t>
+            </w:r>
+          </w:p>
+        </w:tc>
+        <w:tc>
+          <w:tcPr>
+            <w:tcW w:type="dxa" w:w="2257"/>
+          </w:tcPr>
+          <w:p>
+            <w:r>
+              <w:t>视图刷新与来源时间</w:t>
+            </w:r>
+          </w:p>
+        </w:tc>
+        <w:tc>
+          <w:tcPr>
+            <w:tcW w:type="dxa" w:w="2257"/>
+          </w:tcPr>
+          <w:p>
+            <w:r>
+              <w:t>KN-016、KN-017</w:t>
+            </w:r>
+          </w:p>
+        </w:tc>
+      </w:tr>
+      <w:tr>
+        <w:tc>
+          <w:tcPr>
+            <w:tcW w:type="dxa" w:w="2257"/>
+          </w:tcPr>
+          <w:p>
+            <w:r>
+              <w:t>PE-11</w:t>
+            </w:r>
+          </w:p>
+        </w:tc>
+        <w:tc>
+          <w:tcPr>
+            <w:tcW w:type="dxa" w:w="2257"/>
+          </w:tcPr>
+          <w:p>
+            <w:r>
+              <w:t>应急峰值并发在线用户 ≥100人</w:t>
+            </w:r>
+          </w:p>
+        </w:tc>
+        <w:tc>
+          <w:tcPr>
+            <w:tcW w:type="dxa" w:w="2257"/>
+          </w:tcPr>
+          <w:p>
+            <w:r>
+              <w:t>并发负荷、错误率和资源水位</w:t>
+            </w:r>
+          </w:p>
+        </w:tc>
+        <w:tc>
+          <w:tcPr>
+            <w:tcW w:type="dxa" w:w="2257"/>
+          </w:tcPr>
+          <w:p>
+            <w:r>
+              <w:t>KN-028</w:t>
+            </w:r>
+          </w:p>
+        </w:tc>
+      </w:tr>
+      <w:tr>
+        <w:tc>
+          <w:tcPr>
+            <w:tcW w:type="dxa" w:w="2257"/>
+          </w:tcPr>
+          <w:p>
+            <w:r>
+              <w:t>PE-12</w:t>
+            </w:r>
+          </w:p>
+        </w:tc>
+        <w:tc>
+          <w:tcPr>
+            <w:tcW w:type="dxa" w:w="2257"/>
+          </w:tcPr>
+          <w:p>
+            <w:r>
+              <w:t>一年期统计报表生成 ≤5秒</w:t>
+            </w:r>
+          </w:p>
+        </w:tc>
+        <w:tc>
+          <w:tcPr>
+            <w:tcW w:type="dxa" w:w="2257"/>
+          </w:tcPr>
+          <w:p>
+            <w:r>
+              <w:t>统计请求、结果与资源水位</w:t>
+            </w:r>
+          </w:p>
+        </w:tc>
+        <w:tc>
+          <w:tcPr>
+            <w:tcW w:type="dxa" w:w="2257"/>
+          </w:tcPr>
+          <w:p>
+            <w:r>
+              <w:t>KN-037</w:t>
+            </w:r>
+          </w:p>
+        </w:tc>
+      </w:tr>
+    </w:tbl>
     <w:p>
       <w:pPr>
         <w:pStyle w:val="3"/>

</xml_diff>